<commit_message>
Verificando se tudo esta correto
</commit_message>
<xml_diff>
--- a/Logica de Programação e Algoritmos/Aceslimpa.docx
+++ b/Logica de Programação e Algoritmos/Aceslimpa.docx
@@ -1976,7 +1976,7 @@
               <w:rPr>
                 <w:rtl w:val="0"/>
               </w:rPr>
-              <w:t xml:space="preserve">RF5: O sistema deve permitir a atualização de preços dos produtos. </w:t>
+              <w:t xml:space="preserve">RF5: O sistema deve mostrar os produtos cadastrados </w:t>
             </w:r>
           </w:p>
         </w:tc>
@@ -2014,13 +2014,7 @@
               <w:rPr>
                 <w:rtl w:val="0"/>
               </w:rPr>
-              <w:t xml:space="preserve">RNF5</w:t>
-            </w:r>
-            <w:r>
-              <w:rPr>
-                <w:rtl w:val="0"/>
-              </w:rPr>
-              <w:t xml:space="preserve">: O sistema deve possuir interface simples e fácil de utilizar. </w:t>
+              <w:t xml:space="preserve">RNF5: O sistema deve possuir interface simples e fácil de utilizar. </w:t>
             </w:r>
           </w:p>
         </w:tc>
@@ -2064,7 +2058,7 @@
               <w:rPr>
                 <w:rtl w:val="0"/>
               </w:rPr>
-              <w:t xml:space="preserve">RF6: O sistema deve permitir o cadastro de categorias de produtos. </w:t>
+              <w:t xml:space="preserve">RF6: O sistema deve mostrar a descrição do produto.</w:t>
             </w:r>
           </w:p>
         </w:tc>
@@ -2102,7 +2096,7 @@
               <w:rPr>
                 <w:rtl w:val="0"/>
               </w:rPr>
-              <w:t xml:space="preserve">RNF6: O acesso ao sistema deve ser protegido por login e senha. </w:t>
+              <w:t xml:space="preserve">RNF6: O sistema deve funcionar em computadores, tablets e smartphones. </w:t>
             </w:r>
           </w:p>
         </w:tc>
@@ -2146,7 +2140,7 @@
               <w:rPr>
                 <w:rtl w:val="0"/>
               </w:rPr>
-              <w:t xml:space="preserve">RF7: O sistema deve enviar notificações sobre novos pedidos para os funcionários. </w:t>
+              <w:t xml:space="preserve">RF7: O sistema deve mostrar o preço do produto </w:t>
             </w:r>
           </w:p>
         </w:tc>
@@ -2184,253 +2178,7 @@
               <w:rPr>
                 <w:rtl w:val="0"/>
               </w:rPr>
-              <w:t xml:space="preserve">RNF7: Os dados dos clientes e da empresa devem ser armazenados de forma segura. </w:t>
-            </w:r>
-          </w:p>
-        </w:tc>
-      </w:tr>
-      <w:tr>
-        <w:trPr>
-          <w:cantSplit w:val="0"/>
-          <w:tblHeader w:val="0"/>
-        </w:trPr>
-        <w:tc>
-          <w:tcPr>
-            <w:shd w:fill="auto" w:val="clear"/>
-            <w:tcMar>
-              <w:top w:w="100.0" w:type="dxa"/>
-              <w:left w:w="100.0" w:type="dxa"/>
-              <w:bottom w:w="100.0" w:type="dxa"/>
-              <w:right w:w="100.0" w:type="dxa"/>
-            </w:tcMar>
-            <w:vAlign w:val="top"/>
-          </w:tcPr>
-          <w:p>
-            <w:pPr>
-              <w:keepNext w:val="0"/>
-              <w:keepLines w:val="0"/>
-              <w:pageBreakBefore w:val="0"/>
-              <w:widowControl w:val="0"/>
-              <w:pBdr>
-                <w:top w:space="0" w:sz="0" w:val="nil"/>
-                <w:left w:space="0" w:sz="0" w:val="nil"/>
-                <w:bottom w:space="0" w:sz="0" w:val="nil"/>
-                <w:right w:space="0" w:sz="0" w:val="nil"/>
-                <w:between w:space="0" w:sz="0" w:val="nil"/>
-              </w:pBdr>
-              <w:shd w:fill="auto" w:val="clear"/>
-              <w:spacing w:after="0" w:before="0" w:line="240" w:lineRule="auto"/>
-              <w:ind w:left="0" w:right="0" w:firstLine="0"/>
-              <w:jc w:val="left"/>
-              <w:rPr/>
-            </w:pPr>
-            <w:r>
-              <w:rPr>
-                <w:rtl w:val="0"/>
-              </w:rPr>
-              <w:t xml:space="preserve">RF8: O sistema deve permitir o acompanhamento de pedidos em tempo real. </w:t>
-            </w:r>
-          </w:p>
-        </w:tc>
-        <w:tc>
-          <w:tcPr>
-            <w:shd w:fill="auto" w:val="clear"/>
-            <w:tcMar>
-              <w:top w:w="100.0" w:type="dxa"/>
-              <w:left w:w="100.0" w:type="dxa"/>
-              <w:bottom w:w="100.0" w:type="dxa"/>
-              <w:right w:w="100.0" w:type="dxa"/>
-            </w:tcMar>
-            <w:vAlign w:val="top"/>
-          </w:tcPr>
-          <w:p>
-            <w:pPr>
-              <w:keepNext w:val="0"/>
-              <w:keepLines w:val="0"/>
-              <w:pageBreakBefore w:val="0"/>
-              <w:widowControl w:val="0"/>
-              <w:pBdr>
-                <w:top w:space="0" w:sz="0" w:val="nil"/>
-                <w:left w:space="0" w:sz="0" w:val="nil"/>
-                <w:bottom w:space="0" w:sz="0" w:val="nil"/>
-                <w:right w:space="0" w:sz="0" w:val="nil"/>
-                <w:between w:space="0" w:sz="0" w:val="nil"/>
-              </w:pBdr>
-              <w:shd w:fill="auto" w:val="clear"/>
-              <w:spacing w:after="0" w:before="0" w:line="240" w:lineRule="auto"/>
-              <w:ind w:left="0" w:right="0" w:firstLine="0"/>
-              <w:jc w:val="left"/>
-              <w:rPr/>
-            </w:pPr>
-            <w:r>
-              <w:rPr>
-                <w:rtl w:val="0"/>
-              </w:rPr>
-              <w:t xml:space="preserve">RNF8: O sistema deve funcionar em computadores, tablets e smartphones. </w:t>
-            </w:r>
-          </w:p>
-        </w:tc>
-      </w:tr>
-      <w:tr>
-        <w:trPr>
-          <w:cantSplit w:val="0"/>
-          <w:tblHeader w:val="0"/>
-        </w:trPr>
-        <w:tc>
-          <w:tcPr>
-            <w:shd w:fill="auto" w:val="clear"/>
-            <w:tcMar>
-              <w:top w:w="100.0" w:type="dxa"/>
-              <w:left w:w="100.0" w:type="dxa"/>
-              <w:bottom w:w="100.0" w:type="dxa"/>
-              <w:right w:w="100.0" w:type="dxa"/>
-            </w:tcMar>
-            <w:vAlign w:val="top"/>
-          </w:tcPr>
-          <w:p>
-            <w:pPr>
-              <w:keepNext w:val="0"/>
-              <w:keepLines w:val="0"/>
-              <w:pageBreakBefore w:val="0"/>
-              <w:widowControl w:val="0"/>
-              <w:pBdr>
-                <w:top w:space="0" w:sz="0" w:val="nil"/>
-                <w:left w:space="0" w:sz="0" w:val="nil"/>
-                <w:bottom w:space="0" w:sz="0" w:val="nil"/>
-                <w:right w:space="0" w:sz="0" w:val="nil"/>
-                <w:between w:space="0" w:sz="0" w:val="nil"/>
-              </w:pBdr>
-              <w:shd w:fill="auto" w:val="clear"/>
-              <w:spacing w:after="0" w:before="0" w:line="240" w:lineRule="auto"/>
-              <w:ind w:left="0" w:right="0" w:firstLine="0"/>
-              <w:jc w:val="left"/>
-              <w:rPr/>
-            </w:pPr>
-            <w:r>
-              <w:rPr>
-                <w:rtl w:val="0"/>
-              </w:rPr>
-              <w:t xml:space="preserve">RF9: O sistema deve permitir a geração de gráficos de vendas e estoque. </w:t>
-            </w:r>
-          </w:p>
-        </w:tc>
-        <w:tc>
-          <w:tcPr>
-            <w:shd w:fill="auto" w:val="clear"/>
-            <w:tcMar>
-              <w:top w:w="100.0" w:type="dxa"/>
-              <w:left w:w="100.0" w:type="dxa"/>
-              <w:bottom w:w="100.0" w:type="dxa"/>
-              <w:right w:w="100.0" w:type="dxa"/>
-            </w:tcMar>
-            <w:vAlign w:val="top"/>
-          </w:tcPr>
-          <w:p>
-            <w:pPr>
-              <w:keepNext w:val="0"/>
-              <w:keepLines w:val="0"/>
-              <w:pageBreakBefore w:val="0"/>
-              <w:widowControl w:val="0"/>
-              <w:pBdr>
-                <w:top w:space="0" w:sz="0" w:val="nil"/>
-                <w:left w:space="0" w:sz="0" w:val="nil"/>
-                <w:bottom w:space="0" w:sz="0" w:val="nil"/>
-                <w:right w:space="0" w:sz="0" w:val="nil"/>
-                <w:between w:space="0" w:sz="0" w:val="nil"/>
-              </w:pBdr>
-              <w:shd w:fill="auto" w:val="clear"/>
-              <w:spacing w:after="0" w:before="0" w:line="240" w:lineRule="auto"/>
-              <w:ind w:left="0" w:right="0" w:firstLine="0"/>
-              <w:jc w:val="left"/>
-              <w:rPr/>
-            </w:pPr>
-            <w:r>
-              <w:rPr>
-                <w:rtl w:val="0"/>
-              </w:rPr>
-              <w:t xml:space="preserve">RNF9: O sistema deve permitir atualizações sem comprometer os dados já cadastrados. </w:t>
-            </w:r>
-          </w:p>
-        </w:tc>
-      </w:tr>
-      <w:tr>
-        <w:trPr>
-          <w:cantSplit w:val="0"/>
-          <w:tblHeader w:val="0"/>
-        </w:trPr>
-        <w:tc>
-          <w:tcPr>
-            <w:shd w:fill="auto" w:val="clear"/>
-            <w:tcMar>
-              <w:top w:w="100.0" w:type="dxa"/>
-              <w:left w:w="100.0" w:type="dxa"/>
-              <w:bottom w:w="100.0" w:type="dxa"/>
-              <w:right w:w="100.0" w:type="dxa"/>
-            </w:tcMar>
-            <w:vAlign w:val="top"/>
-          </w:tcPr>
-          <w:p>
-            <w:pPr>
-              <w:keepNext w:val="0"/>
-              <w:keepLines w:val="0"/>
-              <w:pageBreakBefore w:val="0"/>
-              <w:widowControl w:val="0"/>
-              <w:pBdr>
-                <w:top w:space="0" w:sz="0" w:val="nil"/>
-                <w:left w:space="0" w:sz="0" w:val="nil"/>
-                <w:bottom w:space="0" w:sz="0" w:val="nil"/>
-                <w:right w:space="0" w:sz="0" w:val="nil"/>
-                <w:between w:space="0" w:sz="0" w:val="nil"/>
-              </w:pBdr>
-              <w:shd w:fill="auto" w:val="clear"/>
-              <w:spacing w:after="0" w:before="0" w:line="240" w:lineRule="auto"/>
-              <w:ind w:left="0" w:right="0" w:firstLine="0"/>
-              <w:jc w:val="left"/>
-              <w:rPr/>
-            </w:pPr>
-            <w:r>
-              <w:rPr>
-                <w:rtl w:val="0"/>
-              </w:rPr>
-              <w:t xml:space="preserve">RF10: O sistema deve controlar o estoque de cada filial separadamente. </w:t>
-            </w:r>
-          </w:p>
-        </w:tc>
-        <w:tc>
-          <w:tcPr>
-            <w:shd w:fill="auto" w:val="clear"/>
-            <w:tcMar>
-              <w:top w:w="100.0" w:type="dxa"/>
-              <w:left w:w="100.0" w:type="dxa"/>
-              <w:bottom w:w="100.0" w:type="dxa"/>
-              <w:right w:w="100.0" w:type="dxa"/>
-            </w:tcMar>
-            <w:vAlign w:val="top"/>
-          </w:tcPr>
-          <w:p>
-            <w:pPr>
-              <w:keepNext w:val="0"/>
-              <w:keepLines w:val="0"/>
-              <w:pageBreakBefore w:val="0"/>
-              <w:widowControl w:val="0"/>
-              <w:pBdr>
-                <w:top w:space="0" w:sz="0" w:val="nil"/>
-                <w:left w:space="0" w:sz="0" w:val="nil"/>
-                <w:bottom w:space="0" w:sz="0" w:val="nil"/>
-                <w:right w:space="0" w:sz="0" w:val="nil"/>
-                <w:between w:space="0" w:sz="0" w:val="nil"/>
-              </w:pBdr>
-              <w:shd w:fill="auto" w:val="clear"/>
-              <w:spacing w:after="0" w:before="0" w:line="240" w:lineRule="auto"/>
-              <w:ind w:left="0" w:right="0" w:firstLine="0"/>
-              <w:jc w:val="left"/>
-              <w:rPr/>
-            </w:pPr>
-            <w:r>
-              <w:rPr>
-                <w:rtl w:val="0"/>
-              </w:rPr>
-              <w:t xml:space="preserve">RNF10: O sistema deve garantir a integridade das informações armazenadas.</w:t>
+              <w:t xml:space="preserve">RNF7: O sistema deve garantir a integridade das informações armazenadas. </w:t>
             </w:r>
           </w:p>
         </w:tc>

</xml_diff>